<commit_message>
Add bulk emerging theme approval flow
</commit_message>
<xml_diff>
--- a/docs/deliverables/TextAI_Emerging_Theme_Dashboard_Preference_Product_Brief.docx
+++ b/docs/deliverables/TextAI_Emerging_Theme_Dashboard_Preference_Product_Brief.docx
@@ -13,7 +13,7 @@
           <w:color w:val="2E74B5"/>
           <w:sz w:val="20"/>
         </w:rPr>
-        <w:t>TEXTAI DASHBOARD SETTINGS</w:t>
+        <w:t>TEXTAI EMERGING THEME MANAGEMENT</w:t>
       </w:r>
     </w:p>
     <w:p>
@@ -27,7 +27,7 @@
           <w:color w:val="10253F"/>
           <w:sz w:val="48"/>
         </w:rPr>
-        <w:t>Emerging Theme Preference Parity</w:t>
+        <w:t>Emerging Theme Workflow</w:t>
       </w:r>
     </w:p>
     <w:p>
@@ -40,7 +40,7 @@
           <w:color w:val="65707B"/>
           <w:sz w:val="25"/>
         </w:rPr>
-        <w:t>Short product brief and prototype walkthrough</w:t>
+        <w:t>Product requirements and prototype walkthrough</w:t>
       </w:r>
     </w:p>
     <w:p>
@@ -92,7 +92,7 @@
           <w:color w:val="2C3640"/>
           <w:sz w:val="21"/>
         </w:rPr>
-        <w:t>Theme Configuration already lets users control whether emerging themes and sub-themes are auto-approved and shown on a TextAI dashboard. Dashboard Settings did not expose the same preference, forcing users to leave the dashboard to change it. The dashboard Preferences tab should provide the same toggle, persist the same per-dashboard value, and update both screens immediately.</w:t>
+        <w:t>TextAI must support the full lifecycle for themes and sub-themes marked Emerging: identification, filtering, approval, dashboard visibility, and logging. Users need one per-dashboard auto-approval preference in Dashboard Settings and Theme Configuration. When it is off, they must be able to approve one item or all items through clear confirmation, with immediate and persistent widget updates.</w:t>
       </w:r>
     </w:p>
     <w:p>
@@ -147,7 +147,7 @@
           <w:color w:val="2C3640"/>
           <w:sz w:val="21"/>
         </w:rPr>
-        <w:t>Open any completed TextAI dashboard from the TextAI list.</w:t>
+        <w:t>Open any completed TextAI dashboard, then open Theme Configuration.</w:t>
       </w:r>
     </w:p>
     <w:p>
@@ -170,7 +170,7 @@
           <w:color w:val="2C3640"/>
           <w:sz w:val="21"/>
         </w:rPr>
-        <w:t>Select the Dashboard settings gear, then open Preferences.</w:t>
+        <w:t>Filter Theme Configuration to Emerging and review the badges.</w:t>
       </w:r>
     </w:p>
     <w:p>
@@ -193,7 +193,7 @@
           <w:color w:val="2C3640"/>
           <w:sz w:val="21"/>
         </w:rPr>
-        <w:t>Find Auto approve emerging themes below Show themes with no responses.</w:t>
+        <w:t>Turn off Auto approve emerging themes; confirm Dashboard Settings matches.</w:t>
       </w:r>
     </w:p>
     <w:p>
@@ -216,7 +216,7 @@
           <w:color w:val="2C3640"/>
           <w:sz w:val="21"/>
         </w:rPr>
-        <w:t>Change the toggle, then open Theme Configuration settings to verify the same state.</w:t>
+        <w:t>Click Approve; approve one item or select Approve all and confirm in the next normal dialog.</w:t>
       </w:r>
     </w:p>
     <w:p>
@@ -238,7 +238,7 @@
           <w:color w:val="65707B"/>
           <w:sz w:val="19"/>
         </w:rPr>
-        <w:t>Per dashboard. Both settings surfaces use the same stored preference and change event.</w:t>
+        <w:t>Per dashboard; both settings surfaces and supported widgets share the preference and approved-name list.</w:t>
       </w:r>
     </w:p>
     <w:p>
@@ -295,7 +295,7 @@
           <w:color w:val="65707B"/>
           <w:sz w:val="18"/>
         </w:rPr>
-        <w:t>Figure 1. Dashboard Settings &gt; Preferences includes the emerging-theme auto-approval toggle.</w:t>
+        <w:t>Figure 1. Dashboard Settings &gt; Preferences exposes the shared emerging-theme auto-approval control.</w:t>
       </w:r>
     </w:p>
     <w:p>
@@ -324,7 +324,7 @@
           <w:color w:val="1F4D78"/>
           <w:sz w:val="21"/>
         </w:rPr>
-        <w:t xml:space="preserve">AC-01 — Placement and consistency  </w:t>
+        <w:t xml:space="preserve">AC-01 — Identification and filtering  </w:t>
       </w:r>
       <w:r>
         <w:rPr>
@@ -332,7 +332,7 @@
           <w:color w:val="2C3640"/>
           <w:sz w:val="21"/>
         </w:rPr>
-        <w:t>Dashboard Settings &gt; Preferences shows Auto approve emerging themes directly below Show themes with no responses, using the same label, helper text, switch styling, spacing, and accessible name as Theme Configuration.</w:t>
+        <w:t>Emerging themes and sub-themes display a consistent Emerging badge in Theme Configuration and supported widgets. The theme-status control can isolate emerging content without misclassifying established items.</w:t>
       </w:r>
     </w:p>
     <w:p>
@@ -347,7 +347,7 @@
           <w:color w:val="1F4D78"/>
           <w:sz w:val="21"/>
         </w:rPr>
-        <w:t xml:space="preserve">AC-02 — Shared source of truth  </w:t>
+        <w:t xml:space="preserve">AC-02 — Shared preference  </w:t>
       </w:r>
       <w:r>
         <w:rPr>
@@ -355,7 +355,7 @@
           <w:color w:val="2C3640"/>
           <w:sz w:val="21"/>
         </w:rPr>
-        <w:t>Both settings surfaces read and write the same per-dashboard theme preference. The dashboard modal must not maintain a separate copy, key, default, or save path.</w:t>
+        <w:t>Dashboard Settings &gt; Preferences and Theme Configuration expose the same Auto approve emerging themes switch, helper text, accessible name, per-dashboard storage value, default, and change event.</w:t>
       </w:r>
     </w:p>
     <w:p>
@@ -370,7 +370,7 @@
           <w:color w:val="1F4D78"/>
           <w:sz w:val="21"/>
         </w:rPr>
-        <w:t xml:space="preserve">AC-03 — Dashboard-to-configuration sync  </w:t>
+        <w:t xml:space="preserve">AC-03 — Auto-approval enabled  </w:t>
       </w:r>
       <w:r>
         <w:rPr>
@@ -378,7 +378,7 @@
           <w:color w:val="2C3640"/>
           <w:sz w:val="21"/>
         </w:rPr>
-        <w:t>Changing the switch in Dashboard Settings immediately updates Theme Configuration settings for the same dashboard without requiring a page reload.</w:t>
+        <w:t>When enabled, emerging themes and sub-themes are eligible to appear in supported dashboard widgets without manual approval, while retaining their Emerging badge and status-filter behavior.</w:t>
       </w:r>
     </w:p>
     <w:p>
@@ -393,7 +393,7 @@
           <w:color w:val="1F4D78"/>
           <w:sz w:val="21"/>
         </w:rPr>
-        <w:t xml:space="preserve">AC-04 — Configuration-to-dashboard sync  </w:t>
+        <w:t xml:space="preserve">AC-04 — Auto-approval disabled  </w:t>
       </w:r>
       <w:r>
         <w:rPr>
@@ -401,7 +401,7 @@
           <w:color w:val="2C3640"/>
           <w:sz w:val="21"/>
         </w:rPr>
-        <w:t>Changing the switch in Theme Configuration immediately updates Dashboard Settings and the open dashboard through the existing preference-change event.</w:t>
+        <w:t>Turning the switch off clears previously approved emerging names. Unapproved emerging items remain available for review in Theme Configuration but stay hidden from supported dashboard widgets until approved.</w:t>
       </w:r>
     </w:p>
     <w:p>
@@ -416,7 +416,7 @@
           <w:color w:val="1F4D78"/>
           <w:sz w:val="21"/>
         </w:rPr>
-        <w:t xml:space="preserve">AC-05 — Enabled behavior  </w:t>
+        <w:t xml:space="preserve">AC-05 — Single-item approval  </w:t>
       </w:r>
       <w:r>
         <w:rPr>
@@ -424,7 +424,7 @@
           <w:color w:val="2C3640"/>
           <w:sz w:val="21"/>
         </w:rPr>
-        <w:t>When enabled, new emerging themes and sub-themes are auto-approved and are eligible to appear in supported dashboard widgets without manual approval.</w:t>
+        <w:t>Each unapproved emerging theme or sub-theme shows Approve. The dialog supports Cancel and Approve; approving a theme also approves its sub-themes, while approving a sub-theme affects only that item.</w:t>
       </w:r>
     </w:p>
     <w:p>
@@ -439,7 +439,7 @@
           <w:color w:val="1F4D78"/>
           <w:sz w:val="21"/>
         </w:rPr>
-        <w:t xml:space="preserve">AC-06 — Disabled behavior  </w:t>
+        <w:t xml:space="preserve">AC-06 — Approve-all entry point  </w:t>
       </w:r>
       <w:r>
         <w:rPr>
@@ -447,7 +447,7 @@
           <w:color w:val="2C3640"/>
           <w:sz w:val="21"/>
         </w:rPr>
-        <w:t>When disabled, manually approved emerging names are cleared and unapproved emerging themes and sub-themes are hidden from the dashboard until approved through the existing flow.</w:t>
+        <w:t>The single-item approval dialog also shows Approve all as a secondary CTA. Selecting it closes the first dialog and opens a separate confirmation without applying any approval yet.</w:t>
       </w:r>
     </w:p>
     <w:p>
@@ -504,7 +504,7 @@
           <w:color w:val="65707B"/>
           <w:sz w:val="18"/>
         </w:rPr>
-        <w:t>Figure 2. Theme Configuration exposes the same control and reads the same per-dashboard state.</w:t>
+        <w:t>Figure 2. Theme Configuration settings use the same per-dashboard preference as Dashboard Settings.</w:t>
       </w:r>
     </w:p>
     <w:p>
@@ -533,7 +533,7 @@
           <w:color w:val="1F4D78"/>
           <w:sz w:val="21"/>
         </w:rPr>
-        <w:t xml:space="preserve">AC-07 — Dashboard rendering  </w:t>
+        <w:t xml:space="preserve">AC-07 — Approve-all confirmation  </w:t>
       </w:r>
       <w:r>
         <w:rPr>
@@ -541,7 +541,7 @@
           <w:color w:val="2C3640"/>
           <w:sz w:val="21"/>
         </w:rPr>
-        <w:t>Theme and sub-theme widgets re-evaluate visibility from the updated preference so the dashboard reflects the change immediately and consistently.</w:t>
+        <w:t>The second dialog uses normal, non-critical styling, reports the number of emerging themes and sub-themes affected, states that the action cannot be undone, and provides Cancel plus a standard primary Approve all action.</w:t>
       </w:r>
     </w:p>
     <w:p>
@@ -556,7 +556,7 @@
           <w:color w:val="1F4D78"/>
           <w:sz w:val="21"/>
         </w:rPr>
-        <w:t xml:space="preserve">AC-08 — Persistence and isolation  </w:t>
+        <w:t xml:space="preserve">AC-08 — Bulk result and logging  </w:t>
       </w:r>
       <w:r>
         <w:rPr>
@@ -564,7 +564,7 @@
           <w:color w:val="2C3640"/>
           <w:sz w:val="21"/>
         </w:rPr>
-        <w:t>The selected value survives modal close, navigation, and reload for that dashboard. Changing one dashboard must not change another dashboard’s preference.</w:t>
+        <w:t>Confirming Approve all adds every currently emerging theme and sub-theme name to the approved set, makes them eligible for dashboard display, closes the dialog, and writes one activity-log entry with both affected counts.</w:t>
       </w:r>
     </w:p>
     <w:p>
@@ -579,7 +579,7 @@
           <w:color w:val="1F4D78"/>
           <w:sz w:val="21"/>
         </w:rPr>
-        <w:t xml:space="preserve">AC-09 — Defaults and compatibility  </w:t>
+        <w:t xml:space="preserve">AC-09 — Rendering, sync, and persistence  </w:t>
       </w:r>
       <w:r>
         <w:rPr>
@@ -587,7 +587,7 @@
           <w:color w:val="2C3640"/>
           <w:sz w:val="21"/>
         </w:rPr>
-        <w:t>Dashboards without a saved preference continue to use the existing default of enabled. Existing saved preferences and manually approved-name data remain readable.</w:t>
+        <w:t>Preference and approval changes refresh supported theme, sub-theme, topic, and analysis widgets immediately. Values survive modal close, navigation, and reload and remain isolated from other dashboards.</w:t>
       </w:r>
     </w:p>
     <w:p>
@@ -610,7 +610,7 @@
           <w:color w:val="2C3640"/>
           <w:sz w:val="21"/>
         </w:rPr>
-        <w:t>The switch supports keyboard operation, exposes a meaningful checked state and accessible name, and does not alter the behavior of Show themes with no responses or other dashboard settings tabs.</w:t>
+        <w:t>Badges, filters, switches, approval controls, dialog titles, and focus behavior are keyboard and screen-reader usable. Existing theme editing, no-response filtering, granularity, recoding, and other settings remain unchanged.</w:t>
       </w:r>
     </w:p>
     <w:p>
@@ -632,7 +632,7 @@
           <w:color w:val="2C3640"/>
           <w:sz w:val="21"/>
         </w:rPr>
-        <w:t>Turning the control off in either settings surface publishes the shared preference, clears manually approved emerging names, and causes subscribed dashboard widgets and the other settings surface to refresh from the same value.</w:t>
+        <w:t>With auto approval on, emerging items can appear immediately. Turning it off clears manual approvals and hides emerging items from supported widgets while keeping them reviewable in Theme Configuration. A user can then approve one item or choose Approve all; bulk approval is applied only after the separate normal confirmation dialog and is recorded in Logs.</w:t>
       </w:r>
     </w:p>
     <w:p>
@@ -689,7 +689,7 @@
           <w:color w:val="65707B"/>
           <w:sz w:val="18"/>
         </w:rPr>
-        <w:t>Figure 3. One per-dashboard preference keeps both controls synchronized and hides unapproved emerging themes when off.</w:t>
+        <w:t>Figure 3. One per-dashboard preference synchronizes both settings surfaces and controls emerging-item visibility.</w:t>
       </w:r>
     </w:p>
     <w:p>

</xml_diff>

<commit_message>
feat(textai): expand emerging themes and KPI widget prototype
</commit_message>
<xml_diff>
--- a/docs/deliverables/TextAI_Emerging_Theme_Dashboard_Preference_Product_Brief.docx
+++ b/docs/deliverables/TextAI_Emerging_Theme_Dashboard_Preference_Product_Brief.docx
@@ -153,7 +153,7 @@
           <w:sz-cs w:val="29"/>
           <w:color w:val="000000"/>
         </w:rPr>
-        <w:t>TextAI must support the full lifecycle for themes and sub-themes marked Emerging: identification, filtering, approval, dashboard visibility, and logging. Users need one per-dashboard auto-approval preference in Dashboard Settings and Theme Configuration. When it is off, they must be able to approve one item or all items through clear confirmation, with immediate and persistent widget updates. Users also need a per-dashboard validity period that determines when an emerging theme or sub-theme becomes Established.</w:t>
+        <w:t>TextAI must support the full lifecycle for themes and sub-themes marked Emerging: identification, filtering, approval, dashboard visibility, and logging. Users need one per-dashboard auto-approval preference in Dashboard Settings and Theme Configuration. When auto-approval is off, users must be able to select emerging sub-themes directly in Theme Configuration and approve one or several selected items immediately from the standard bulk-action bar. Approval must remain available only while every selected item is an unapproved Emerging sub-theme. The hierarchy must remain valid: when an approved sub-theme belongs to an Emerging parent theme, that parent theme is approved automatically. Users also need a per-dashboard validity period that determines when an emerging theme or sub-theme becomes Established.</w:t>
       </w:r>
     </w:p>
     <w:p>
@@ -304,7 +304,7 @@
           <w:sz-cs w:val="29"/>
           <w:color w:val="000000"/>
         </w:rPr>
-        <w:t>Set Emerging theme validity to 7, 14, or 28 days. Then turn off Auto approve emerging themes and observe the ‘approve’ option on themes and sub-themes.</w:t>
+        <w:t>Set Emerging theme validity to One week, Two weeks, or One month. Then turn off Auto approve emerging themes and observe the manual approval workflow in Theme Configuration.</w:t>
       </w:r>
     </w:p>
     <w:p>
@@ -329,20 +329,22 @@
           <w:sz-cs w:val="29"/>
           <w:color w:val="000000"/>
         </w:rPr>
-        <w:t xml:space="preserve">Click Approve; approve one item or select Approve all and confirm in the next normal dialog.</w:t>
-      </w:r>
-      <w:r>
-        <w:rPr>
-          <w:rFonts w:ascii="Times" w:hAnsi="Times" w:cs="Times"/>
-          <w:sz w:val="24"/>
-          <w:sz-cs w:val="24"/>
-          <w:color w:val="000000"/>
-        </w:rPr>
-        <w:t xml:space="preserve"/>
-      </w:r>
-    </w:p>
-    <w:p>
-      <w:pPr>
+        <w:t>Click one or more emerging sub-theme cards. Confirm that selected cards use the green selection state and the bottom action bar shows the selected count and Approve; parent theme headers remain expand/collapse controls only. Click Approve to apply the selection immediately without a confirmation dialog. If a selected sub-theme's parent theme is also Emerging, confirm that the parent theme is approved automatically.</w:t>
+      </w:r>
+      <w:r>
+        <w:rPr>
+          <w:rFonts w:ascii="Times" w:hAnsi="Times" w:cs="Times"/>
+          <w:sz w:val="24"/>
+          <w:sz-cs w:val="24"/>
+          <w:color w:val="000000"/>
+        </w:rPr>
+        <w:t xml:space="preserve"/>
+      </w:r>
+    </w:p>
+    <w:p>
+      <w:pPr>
+        <w:keepNext/>
+        <w:pageBreakBefore/>
         <w:spacing w:after="373"/>
       </w:pPr>
       <w:r>
@@ -369,6 +371,7 @@
     </w:p>
     <w:p>
       <w:pPr>
+        <w:keepLines/>
         <w:spacing w:after="106"/>
       </w:pPr>
       <w:r>
@@ -402,6 +405,7 @@
     </w:p>
     <w:p>
       <w:pPr>
+        <w:keepLines/>
         <w:spacing w:after="106"/>
       </w:pPr>
       <w:r>
@@ -435,6 +439,7 @@
     </w:p>
     <w:p>
       <w:pPr>
+        <w:keepLines/>
         <w:spacing w:after="106"/>
       </w:pPr>
       <w:r>
@@ -459,6 +464,7 @@
     </w:p>
     <w:p>
       <w:pPr>
+        <w:keepLines/>
         <w:spacing w:after="106"/>
       </w:pPr>
       <w:r>
@@ -478,152 +484,157 @@
           <w:sz-cs w:val="29"/>
           <w:color w:val="000000"/>
         </w:rPr>
-        <w:t xml:space="preserve">When disabled the emerging themes stop showing up in the dashboard, and the theme status dropdown from the dashboard screen goes away. </w:t>
-      </w:r>
-      <w:r>
-        <w:rPr>
-          <w:rFonts w:ascii="Times" w:hAnsi="Times" w:cs="Times"/>
-          <w:sz w:val="24"/>
-          <w:sz-cs w:val="24"/>
-          <w:color w:val="000000"/>
-        </w:rPr>
-        <w:t xml:space="preserve"/>
-      </w:r>
-    </w:p>
-    <w:p>
-      <w:pPr>
-        <w:spacing w:after="106"/>
-      </w:pPr>
-      <w:r>
-        <w:rPr>
-          <w:rFonts w:ascii="Arial" w:hAnsi="Arial" w:cs="Arial"/>
-          <w:sz w:val="29"/>
-          <w:sz-cs w:val="29"/>
-          <w:b/>
-          <w:color w:val="000000"/>
-        </w:rPr>
-        <w:t xml:space="preserve">AC-05 — Single-item approval  </w:t>
-      </w:r>
-      <w:r>
-        <w:rPr>
-          <w:rFonts w:ascii="Arial" w:hAnsi="Arial" w:cs="Arial"/>
-          <w:sz w:val="29"/>
-          <w:sz-cs w:val="29"/>
-          <w:color w:val="000000"/>
-        </w:rPr>
-        <w:t xml:space="preserve">Each unapproved emerging theme or sub-theme shows Approve. The dialog supports Cancel and Approve; approving a theme also approves its sub-themes, while approving a sub-theme affects only that item.</w:t>
-      </w:r>
-      <w:r>
-        <w:rPr>
-          <w:rFonts w:ascii="Times" w:hAnsi="Times" w:cs="Times"/>
-          <w:sz w:val="24"/>
-          <w:sz-cs w:val="24"/>
-          <w:color w:val="000000"/>
-        </w:rPr>
-        <w:t xml:space="preserve"/>
-      </w:r>
-    </w:p>
-    <w:p>
-      <w:pPr>
-        <w:spacing w:after="106"/>
-      </w:pPr>
-      <w:r>
-        <w:rPr>
-          <w:rFonts w:ascii="Arial" w:hAnsi="Arial" w:cs="Arial"/>
-          <w:sz w:val="29"/>
-          <w:sz-cs w:val="29"/>
-          <w:b/>
-          <w:color w:val="000000"/>
-        </w:rPr>
-        <w:t xml:space="preserve">AC-06 — Approve-all entry point  </w:t>
-      </w:r>
-      <w:r>
-        <w:rPr>
-          <w:rFonts w:ascii="Arial" w:hAnsi="Arial" w:cs="Arial"/>
-          <w:sz w:val="29"/>
-          <w:sz-cs w:val="29"/>
-          <w:color w:val="000000"/>
-        </w:rPr>
-        <w:t xml:space="preserve">The single-item approval dialog also shows Approve all as a secondary CTA. Selecting it closes the first dialog and opens a separate confirmation without applying any approval yet.</w:t>
-      </w:r>
-      <w:r>
-        <w:rPr>
-          <w:rFonts w:ascii="Times" w:hAnsi="Times" w:cs="Times"/>
-          <w:sz w:val="24"/>
-          <w:sz-cs w:val="24"/>
-          <w:color w:val="000000"/>
-        </w:rPr>
-        <w:t xml:space="preserve"/>
-      </w:r>
-    </w:p>
-    <w:p>
-      <w:pPr>
-        <w:spacing w:after="106"/>
-      </w:pPr>
-      <w:r>
-        <w:rPr>
-          <w:rFonts w:ascii="Arial" w:hAnsi="Arial" w:cs="Arial"/>
-          <w:sz w:val="29"/>
-          <w:sz-cs w:val="29"/>
-          <w:b/>
-          <w:color w:val="000000"/>
-        </w:rPr>
-        <w:t xml:space="preserve">AC-07 — Approve-all confirmation  </w:t>
-      </w:r>
-      <w:r>
-        <w:rPr>
-          <w:rFonts w:ascii="Arial" w:hAnsi="Arial" w:cs="Arial"/>
-          <w:sz w:val="29"/>
-          <w:sz-cs w:val="29"/>
-          <w:color w:val="000000"/>
-        </w:rPr>
-        <w:t xml:space="preserve">The second dialog uses normal, non-critical styling, reports the number of emerging themes and sub-themes affected, states that the action cannot be undone, and provides Cancel plus a standard primary Approve all action.</w:t>
-      </w:r>
-      <w:r>
-        <w:rPr>
-          <w:rFonts w:ascii="Times" w:hAnsi="Times" w:cs="Times"/>
-          <w:sz w:val="24"/>
-          <w:sz-cs w:val="24"/>
-          <w:color w:val="000000"/>
-        </w:rPr>
-        <w:t xml:space="preserve"/>
-      </w:r>
-    </w:p>
-    <w:p>
-      <w:pPr>
-        <w:spacing w:after="106"/>
-      </w:pPr>
-      <w:r>
-        <w:rPr>
-          <w:rFonts w:ascii="Arial" w:hAnsi="Arial" w:cs="Arial"/>
-          <w:sz w:val="29"/>
-          <w:sz-cs w:val="29"/>
-          <w:b/>
-          <w:color w:val="000000"/>
-        </w:rPr>
-        <w:t xml:space="preserve">AC-08 — Bulk result and logging  </w:t>
-      </w:r>
-      <w:r>
-        <w:rPr>
-          <w:rFonts w:ascii="Arial" w:hAnsi="Arial" w:cs="Arial"/>
-          <w:sz w:val="29"/>
-          <w:sz-cs w:val="29"/>
-          <w:color w:val="000000"/>
-        </w:rPr>
-        <w:t xml:space="preserve">Confirming Approve all adds every currently emerging theme and sub-theme name to the approved set, makes them eligible for dashboard display, closes the dialog, and writes one activity-log entry with both affected counts.</w:t>
-      </w:r>
-      <w:r>
-        <w:rPr>
-          <w:rFonts w:ascii="Times" w:hAnsi="Times" w:cs="Times"/>
-          <w:sz w:val="24"/>
-          <w:sz-cs w:val="24"/>
-          <w:color w:val="000000"/>
-        </w:rPr>
-        <w:t xml:space="preserve"/>
-      </w:r>
-    </w:p>
-    <w:p>
-      <w:pPr>
+        <w:t>When disabled, emerging themes stop appearing in the dashboard and the theme-status dropdown is removed from the dashboard screen.</w:t>
+      </w:r>
+      <w:r>
+        <w:rPr>
+          <w:rFonts w:ascii="Times" w:hAnsi="Times" w:cs="Times"/>
+          <w:sz w:val="24"/>
+          <w:sz-cs w:val="24"/>
+          <w:color w:val="000000"/>
+        </w:rPr>
+        <w:t xml:space="preserve"/>
+      </w:r>
+    </w:p>
+    <w:p>
+      <w:pPr>
+        <w:keepLines/>
+        <w:spacing w:after="106"/>
+      </w:pPr>
+      <w:r>
+        <w:rPr>
+          <w:rFonts w:ascii="Arial" w:hAnsi="Arial" w:cs="Arial"/>
+          <w:sz w:val="29"/>
+          <w:sz-cs w:val="29"/>
+          <w:b/>
+          <w:color w:val="000000"/>
+        </w:rPr>
+        <w:t xml:space="preserve">AC-05 — Production-aligned sub-theme selection  </w:t>
+      </w:r>
+      <w:r>
+        <w:rPr>
+          <w:rFonts w:ascii="Arial" w:hAnsi="Arial" w:cs="Arial"/>
+          <w:sz w:val="29"/>
+          <w:sz-cs w:val="29"/>
+          <w:color w:val="000000"/>
+        </w:rPr>
+        <w:t>Users select sub-themes by clicking their cards; selection checkboxes are not shown. Every selected sub-theme card uses the production-style pale-green fill and green outline. Parent theme headers are not selectable and continue to function only as expand/collapse controls.</w:t>
+      </w:r>
+      <w:r>
+        <w:rPr>
+          <w:rFonts w:ascii="Times" w:hAnsi="Times" w:cs="Times"/>
+          <w:sz w:val="24"/>
+          <w:sz-cs w:val="24"/>
+          <w:color w:val="000000"/>
+        </w:rPr>
+        <w:t xml:space="preserve"/>
+      </w:r>
+    </w:p>
+    <w:p>
+      <w:pPr>
+        <w:keepLines/>
+        <w:spacing w:after="106"/>
+      </w:pPr>
+      <w:r>
+        <w:rPr>
+          <w:rFonts w:ascii="Arial" w:hAnsi="Arial" w:cs="Arial"/>
+          <w:sz w:val="29"/>
+          <w:sz-cs w:val="29"/>
+          <w:b/>
+          <w:color w:val="000000"/>
+        </w:rPr>
+        <w:t xml:space="preserve">AC-06 — Bulk-action placement  </w:t>
+      </w:r>
+      <w:r>
+        <w:rPr>
+          <w:rFonts w:ascii="Arial" w:hAnsi="Arial" w:cs="Arial"/>
+          <w:sz w:val="29"/>
+          <w:sz-cs w:val="29"/>
+          <w:color w:val="000000"/>
+        </w:rPr>
+        <w:t>Any code-frame selection opens the fixed bottom action bar with Clear selection, the selected-item count, Merge, Add to theme, and Delete in their production locations and enabled or disabled states. Approve appears in this same action bar when the selection is eligible.</w:t>
+      </w:r>
+      <w:r>
+        <w:rPr>
+          <w:rFonts w:ascii="Times" w:hAnsi="Times" w:cs="Times"/>
+          <w:sz w:val="24"/>
+          <w:sz-cs w:val="24"/>
+          <w:color w:val="000000"/>
+        </w:rPr>
+        <w:t xml:space="preserve"/>
+      </w:r>
+    </w:p>
+    <w:p>
+      <w:pPr>
+        <w:keepLines/>
+        <w:spacing w:after="106"/>
+      </w:pPr>
+      <w:r>
+        <w:rPr>
+          <w:rFonts w:ascii="Arial" w:hAnsi="Arial" w:cs="Arial"/>
+          <w:sz w:val="29"/>
+          <w:sz-cs w:val="29"/>
+          <w:b/>
+          <w:color w:val="000000"/>
+        </w:rPr>
+        <w:t xml:space="preserve">AC-07 — Approval eligibility persistence  </w:t>
+      </w:r>
+      <w:r>
+        <w:rPr>
+          <w:rFonts w:ascii="Arial" w:hAnsi="Arial" w:cs="Arial"/>
+          <w:sz w:val="29"/>
+          <w:sz-cs w:val="29"/>
+          <w:color w:val="000000"/>
+        </w:rPr>
+        <w:t>Approve remains visible as long as every selected item is both Emerging and unapproved. Selecting an Established or already-approved item hides Approve without clearing the selection or the other bulk actions; removing the ineligible item restores Approve.</w:t>
+      </w:r>
+      <w:r>
+        <w:rPr>
+          <w:rFonts w:ascii="Times" w:hAnsi="Times" w:cs="Times"/>
+          <w:sz w:val="24"/>
+          <w:sz-cs w:val="24"/>
+          <w:color w:val="000000"/>
+        </w:rPr>
+        <w:t xml:space="preserve"/>
+      </w:r>
+    </w:p>
+    <w:p>
+      <w:pPr>
+        <w:keepLines/>
+        <w:spacing w:after="106"/>
+      </w:pPr>
+      <w:r>
+        <w:rPr>
+          <w:rFonts w:ascii="Arial" w:hAnsi="Arial" w:cs="Arial"/>
+          <w:sz w:val="29"/>
+          <w:sz-cs w:val="29"/>
+          <w:b/>
+          <w:color w:val="000000"/>
+        </w:rPr>
+        <w:t xml:space="preserve">AC-08 — Immediate approval, hierarchy, and logging  </w:t>
+      </w:r>
+      <w:r>
+        <w:rPr>
+          <w:rFonts w:ascii="Arial" w:hAnsi="Arial" w:cs="Arial"/>
+          <w:sz w:val="29"/>
+          <w:sz-cs w:val="29"/>
+          <w:color w:val="000000"/>
+        </w:rPr>
+        <w:t>Clicking Approve applies approval to the current eligible sub-theme selection immediately, without an approval or confirmation dialog, then clears the selection, updates supported dashboard widgets, and writes the appropriate activity-log entry. When an approved sub-theme belongs to an Emerging parent theme, the parent theme is approved automatically so the approved sub-theme has a visible hierarchy; an Established parent theme is not changed. The log records the selected sub-theme approvals and any Emerging parent themes approved automatically.</w:t>
+      </w:r>
+      <w:r>
+        <w:rPr>
+          <w:rFonts w:ascii="Times" w:hAnsi="Times" w:cs="Times"/>
+          <w:sz w:val="24"/>
+          <w:sz-cs w:val="24"/>
+          <w:color w:val="000000"/>
+        </w:rPr>
+        <w:t xml:space="preserve"/>
+      </w:r>
+    </w:p>
+    <w:p>
+      <w:pPr>
+        <w:keepLines/>
         <w:spacing w:after="106"/>
       </w:pPr>
       <w:r>
@@ -643,11 +654,12 @@
           <w:sz-cs w:val="29"/>
           <w:color w:val="000000"/>
         </w:rPr>
-        <w:t>Dashboard Settings and Theme Configuration expose the same per-dashboard Emerging theme validity control with 7-day, 14-day, and 28-day presets. The default is 28 days, and changing either control updates the other surface and the open dashboard immediately.</w:t>
-      </w:r>
-    </w:p>
-    <w:p>
-      <w:pPr>
+        <w:t>Dashboard Settings and Theme Configuration expose the same per-dashboard Emerging theme validity control with One week (7 days), Two weeks (14 days), and One month (30 days) presets. The default is One month, and changing either control updates the other surface and the open dashboard immediately.</w:t>
+      </w:r>
+    </w:p>
+    <w:p>
+      <w:pPr>
+        <w:keepLines/>
         <w:spacing w:after="106"/>
       </w:pPr>
       <w:r>
@@ -672,6 +684,7 @@
     </w:p>
     <w:p>
       <w:pPr>
+        <w:keepLines/>
         <w:spacing w:after="106"/>
       </w:pPr>
       <w:r>

</xml_diff>